<commit_message>
misc: updates on meeting recap and drafts
</commit_message>
<xml_diff>
--- a/meetings/2025_07_01_meeting_recap.docx
+++ b/meetings/2025_07_01_meeting_recap.docx
@@ -5,56 +5,20 @@
     <w:p>
       <w:pPr>
         <w:rPr>
-          <w:lang w:val="es-MX"/>
-        </w:rPr>
-      </w:pPr>
-      <w:proofErr w:type="gramStart"/>
-      <w:r>
-        <w:rPr>
-          <w:lang w:val="es-MX"/>
-        </w:rPr>
-        <w:t>Meeting</w:t>
-      </w:r>
-      <w:proofErr w:type="gramEnd"/>
-      <w:r>
-        <w:rPr>
-          <w:lang w:val="es-MX"/>
-        </w:rPr>
-        <w:t xml:space="preserve"> </w:t>
-      </w:r>
-      <w:proofErr w:type="spellStart"/>
-      <w:r>
-        <w:rPr>
-          <w:lang w:val="es-MX"/>
-        </w:rPr>
-        <w:t>recap</w:t>
-      </w:r>
-      <w:proofErr w:type="spellEnd"/>
-      <w:r>
-        <w:rPr>
-          <w:lang w:val="es-MX"/>
-        </w:rPr>
-        <w:t xml:space="preserve">: </w:t>
-      </w:r>
-      <w:proofErr w:type="spellStart"/>
-      <w:r>
-        <w:rPr>
-          <w:lang w:val="es-MX"/>
-        </w:rPr>
-        <w:t>July</w:t>
-      </w:r>
-      <w:proofErr w:type="spellEnd"/>
-      <w:r>
-        <w:rPr>
-          <w:lang w:val="es-MX"/>
-        </w:rPr>
-        <w:t xml:space="preserve"> 1st, 2025</w:t>
-      </w:r>
-    </w:p>
-    <w:p>
-      <w:pPr>
-        <w:rPr>
-          <w:lang w:val="es-MX"/>
+          <w:lang w:val="en-US"/>
+        </w:rPr>
+      </w:pPr>
+      <w:r>
+        <w:rPr>
+          <w:lang w:val="en-US"/>
+        </w:rPr>
+        <w:t>Meeting recap: July 1st, 2025</w:t>
+      </w:r>
+    </w:p>
+    <w:p>
+      <w:pPr>
+        <w:rPr>
+          <w:lang w:val="en-US"/>
         </w:rPr>
       </w:pPr>
     </w:p>
@@ -63,24 +27,24 @@
         <w:rPr>
           <w:b/>
           <w:bCs/>
-          <w:lang w:val="es-MX"/>
-        </w:rPr>
-      </w:pPr>
-      <w:proofErr w:type="spellStart"/>
+          <w:lang w:val="en-US"/>
+        </w:rPr>
+      </w:pPr>
+      <w:proofErr w:type="gramStart"/>
       <w:r>
         <w:rPr>
           <w:b/>
           <w:bCs/>
-          <w:lang w:val="es-MX"/>
+          <w:lang w:val="en-US"/>
         </w:rPr>
         <w:t>Holly</w:t>
       </w:r>
-      <w:proofErr w:type="spellEnd"/>
+      <w:proofErr w:type="gramEnd"/>
       <w:r>
         <w:rPr>
           <w:b/>
           <w:bCs/>
-          <w:lang w:val="es-MX"/>
+          <w:lang w:val="en-US"/>
         </w:rPr>
         <w:t>:</w:t>
       </w:r>
@@ -189,16 +153,7 @@
           <w:u w:val="single"/>
           <w:lang w:val="en-US"/>
         </w:rPr>
-        <w:t>“</w:t>
-      </w:r>
-      <w:r>
-        <w:rPr>
-          <w:i/>
-          <w:iCs/>
-          <w:u w:val="single"/>
-          <w:lang w:val="en-US"/>
-        </w:rPr>
-        <w:t>VARX-L: Structured regularization for large vector autoregressions with exogenous variables</w:t>
+        <w:t>“VARX-L: Structured regularization for large vector autoregressions with exogenous variables</w:t>
       </w:r>
       <w:r>
         <w:rPr>
@@ -447,11 +402,13 @@
           <w:numId w:val="3"/>
         </w:numPr>
         <w:rPr>
-          <w:lang w:val="en-US"/>
-        </w:rPr>
-      </w:pPr>
-      <w:r>
-        <w:rPr>
+          <w:strike/>
+          <w:lang w:val="en-US"/>
+        </w:rPr>
+      </w:pPr>
+      <w:r>
+        <w:rPr>
+          <w:strike/>
           <w:lang w:val="en-US"/>
         </w:rPr>
         <w:t>Email authors of the G-</w:t>
@@ -459,6 +416,7 @@
       <w:proofErr w:type="spellStart"/>
       <w:r>
         <w:rPr>
+          <w:strike/>
           <w:lang w:val="en-US"/>
         </w:rPr>
         <w:t>MultiVAR</w:t>
@@ -466,9 +424,17 @@
       <w:proofErr w:type="spellEnd"/>
       <w:r>
         <w:rPr>
+          <w:strike/>
           <w:lang w:val="en-US"/>
         </w:rPr>
         <w:t xml:space="preserve"> paper to ask how GIMME was compared to other methods in VAR models.</w:t>
+      </w:r>
+      <w:r>
+        <w:rPr>
+          <w:strike/>
+          <w:lang w:val="en-US"/>
+        </w:rPr>
+        <w:t xml:space="preserve"> </w:t>
       </w:r>
     </w:p>
     <w:p>
@@ -488,19 +454,30 @@
         </w:rPr>
         <w:t xml:space="preserve">Complete code for simulation </w:t>
       </w:r>
-      <w:proofErr w:type="gramStart"/>
-      <w:r>
-        <w:rPr>
-          <w:lang w:val="en-US"/>
-        </w:rPr>
-        <w:t>comparison, and</w:t>
-      </w:r>
-      <w:proofErr w:type="gramEnd"/>
+      <w:r>
+        <w:rPr>
+          <w:lang w:val="en-US"/>
+        </w:rPr>
+        <w:t>comparison and</w:t>
+      </w:r>
       <w:r>
         <w:rPr>
           <w:lang w:val="en-US"/>
         </w:rPr>
         <w:t xml:space="preserve"> run small examples to explore results.</w:t>
+      </w:r>
+      <w:r>
+        <w:rPr>
+          <w:lang w:val="en-US"/>
+        </w:rPr>
+        <w:t xml:space="preserve"> </w:t>
+      </w:r>
+      <w:r>
+        <w:rPr>
+          <w:color w:val="EE0000"/>
+          <w:lang w:val="en-US"/>
+        </w:rPr>
+        <w:t>(In Progress: debugging needed)</w:t>
       </w:r>
     </w:p>
     <w:p>
@@ -520,18 +497,56 @@
         </w:rPr>
         <w:t>Decide on measurements of performance.</w:t>
       </w:r>
-    </w:p>
-    <w:p>
-      <w:pPr>
-        <w:rPr>
-          <w:lang w:val="en-US"/>
-        </w:rPr>
-      </w:pPr>
-      <w:r>
-        <w:rPr>
-          <w:lang w:val="en-US"/>
-        </w:rPr>
-        <w:lastRenderedPageBreak/>
+      <w:r>
+        <w:rPr>
+          <w:lang w:val="en-US"/>
+        </w:rPr>
+        <w:t xml:space="preserve"> </w:t>
+      </w:r>
+      <w:r>
+        <w:rPr>
+          <w:color w:val="EE0000"/>
+          <w:lang w:val="en-US"/>
+        </w:rPr>
+        <w:t>(In Progress:</w:t>
+      </w:r>
+      <w:r>
+        <w:rPr>
+          <w:color w:val="EE0000"/>
+          <w:lang w:val="en-US"/>
+        </w:rPr>
+        <w:t xml:space="preserve"> coding</w:t>
+      </w:r>
+      <w:r>
+        <w:rPr>
+          <w:color w:val="EE0000"/>
+          <w:lang w:val="en-US"/>
+        </w:rPr>
+        <w:t>)</w:t>
+      </w:r>
+    </w:p>
+    <w:p>
+      <w:pPr>
+        <w:pStyle w:val="Prrafodelista"/>
+        <w:numPr>
+          <w:ilvl w:val="1"/>
+          <w:numId w:val="3"/>
+        </w:numPr>
+        <w:rPr>
+          <w:lang w:val="en-US"/>
+        </w:rPr>
+      </w:pPr>
+    </w:p>
+    <w:p>
+      <w:pPr>
+        <w:rPr>
+          <w:lang w:val="en-US"/>
+        </w:rPr>
+      </w:pPr>
+      <w:r>
+        <w:rPr>
+          <w:lang w:val="en-US"/>
+        </w:rPr>
         <w:t>Gene:</w:t>
       </w:r>
     </w:p>
@@ -1617,6 +1632,7 @@
   <w:style w:type="character" w:default="1" w:styleId="Fuentedeprrafopredeter">
     <w:name w:val="Default Paragraph Font"/>
     <w:uiPriority w:val="1"/>
+    <w:semiHidden/>
     <w:unhideWhenUsed/>
   </w:style>
   <w:style w:type="table" w:default="1" w:styleId="Tablanormal">

</xml_diff>

<commit_message>
gimme: first try at fixing paths to zero
</commit_message>
<xml_diff>
--- a/meetings/2025_07_01_meeting_recap.docx
+++ b/meetings/2025_07_01_meeting_recap.docx
@@ -402,39 +402,76 @@
           <w:numId w:val="3"/>
         </w:numPr>
         <w:rPr>
+          <w:lang w:val="en-US"/>
+        </w:rPr>
+      </w:pPr>
+      <w:r>
+        <w:rPr>
           <w:strike/>
           <w:lang w:val="en-US"/>
         </w:rPr>
-      </w:pPr>
+        <w:t>Email authors of the G-</w:t>
+      </w:r>
+      <w:proofErr w:type="spellStart"/>
       <w:r>
         <w:rPr>
           <w:strike/>
           <w:lang w:val="en-US"/>
         </w:rPr>
-        <w:t>Email authors of the G-</w:t>
+        <w:t>MultiVAR</w:t>
+      </w:r>
+      <w:proofErr w:type="spellEnd"/>
+      <w:r>
+        <w:rPr>
+          <w:strike/>
+          <w:lang w:val="en-US"/>
+        </w:rPr>
+        <w:t xml:space="preserve"> paper to ask how GIMME was compared to other methods in VAR models.</w:t>
+      </w:r>
+      <w:r>
+        <w:rPr>
+          <w:lang w:val="en-US"/>
+        </w:rPr>
+        <w:t xml:space="preserve"> </w:t>
+      </w:r>
+      <w:r>
+        <w:rPr>
+          <w:color w:val="EE0000"/>
+          <w:lang w:val="en-US"/>
+        </w:rPr>
+        <w:t xml:space="preserve">(Still not </w:t>
+      </w:r>
+      <w:proofErr w:type="gramStart"/>
+      <w:r>
+        <w:rPr>
+          <w:color w:val="EE0000"/>
+          <w:lang w:val="en-US"/>
+        </w:rPr>
+        <w:t>working:</w:t>
+      </w:r>
+      <w:proofErr w:type="gramEnd"/>
+      <w:r>
+        <w:rPr>
+          <w:color w:val="EE0000"/>
+          <w:lang w:val="en-US"/>
+        </w:rPr>
+        <w:t xml:space="preserve"> I don’t understand how to set paths to zero on </w:t>
       </w:r>
       <w:proofErr w:type="spellStart"/>
       <w:r>
         <w:rPr>
-          <w:strike/>
-          <w:lang w:val="en-US"/>
-        </w:rPr>
-        <w:t>MultiVAR</w:t>
+          <w:color w:val="EE0000"/>
+          <w:lang w:val="en-US"/>
+        </w:rPr>
+        <w:t>gimmeSEM</w:t>
       </w:r>
       <w:proofErr w:type="spellEnd"/>
       <w:r>
         <w:rPr>
-          <w:strike/>
-          <w:lang w:val="en-US"/>
-        </w:rPr>
-        <w:t xml:space="preserve"> paper to ask how GIMME was compared to other methods in VAR models.</w:t>
-      </w:r>
-      <w:r>
-        <w:rPr>
-          <w:strike/>
-          <w:lang w:val="en-US"/>
-        </w:rPr>
-        <w:t xml:space="preserve"> </w:t>
+          <w:color w:val="EE0000"/>
+          <w:lang w:val="en-US"/>
+        </w:rPr>
+        <w:t>)</w:t>
       </w:r>
     </w:p>
     <w:p>
@@ -495,6 +532,7 @@
         <w:rPr>
           <w:lang w:val="en-US"/>
         </w:rPr>
+        <w:lastRenderedPageBreak/>
         <w:t>Decide on measurements of performance.</w:t>
       </w:r>
       <w:r>

</xml_diff>